<commit_message>
vault backup: 2026-02-17 10:52:11
</commit_message>
<xml_diff>
--- a/Materias/Diseño de sistemas/Material/TP1/Flujos de sucesos/CU11 - Entregar servicio/CU - Entregar servicio.docx
+++ b/Materias/Diseño de sistemas/Material/TP1/Flujos de sucesos/CU11 - Entregar servicio/CU - Entregar servicio.docx
@@ -7947,12 +7947,12 @@
           <wp:inline distB="114300" distT="114300" distL="114300" distR="114300">
             <wp:extent cx="5224463" cy="3757794"/>
             <wp:effectExtent b="0" l="0" r="0" t="0"/>
-            <wp:docPr id="1" name="image4.png"/>
+            <wp:docPr id="1" name="image5.png"/>
             <a:graphic>
               <a:graphicData uri="http://schemas.openxmlformats.org/drawingml/2006/picture">
                 <pic:pic>
                   <pic:nvPicPr>
-                    <pic:cNvPr id="0" name="image4.png"/>
+                    <pic:cNvPr id="0" name="image5.png"/>
                     <pic:cNvPicPr preferRelativeResize="0"/>
                   </pic:nvPicPr>
                   <pic:blipFill>
@@ -8109,12 +8109,12 @@
           <wp:inline distB="114300" distT="114300" distL="114300" distR="114300">
             <wp:extent cx="4670831" cy="5182443"/>
             <wp:effectExtent b="0" l="0" r="0" t="0"/>
-            <wp:docPr id="3" name="image5.png"/>
+            <wp:docPr id="3" name="image4.png"/>
             <a:graphic>
               <a:graphicData uri="http://schemas.openxmlformats.org/drawingml/2006/picture">
                 <pic:pic>
                   <pic:nvPicPr>
-                    <pic:cNvPr id="0" name="image5.png"/>
+                    <pic:cNvPr id="0" name="image4.png"/>
                     <pic:cNvPicPr preferRelativeResize="0"/>
                   </pic:nvPicPr>
                   <pic:blipFill>

</xml_diff>